<commit_message>
Perbaikan format tanggal & sembunyikan {{sig_approver}} dsb di form BA
</commit_message>
<xml_diff>
--- a/SistemBeritaAcara.Web/wwwroot/files/documents/ba-140-draft.docx
+++ b/SistemBeritaAcara.Web/wwwroot/files/documents/ba-140-draft.docx
@@ -1248,7 +1248,7 @@
           <w:sz w:val="18"/>
           <w:szCs w:val="18"/>
         </w:rPr>
-        <w:t xml:space="preserve">Pada hari ini Rabu Tanggal 17 Juni 2026 telah diserahterimakan perangkat dengan spesifikasi serta syarat-syarat dan ketentuan sebagai berikut:</w:t>
+        <w:t xml:space="preserve">Pada </w:t>
       </w:r>
       <w:proofErr w:type="spellStart"/>
       <w:r>
@@ -1258,7 +1258,7 @@
           <w:sz w:val="18"/>
           <w:szCs w:val="18"/>
         </w:rPr>
-        <w:t/>
+        <w:t>hari</w:t>
       </w:r>
       <w:proofErr w:type="spellEnd"/>
       <w:r>
@@ -1268,7 +1268,7 @@
           <w:sz w:val="18"/>
           <w:szCs w:val="18"/>
         </w:rPr>
-        <w:t xml:space="preserve"/>
+        <w:t xml:space="preserve"> </w:t>
       </w:r>
       <w:proofErr w:type="spellStart"/>
       <w:r>
@@ -1278,7 +1278,7 @@
           <w:sz w:val="18"/>
           <w:szCs w:val="18"/>
         </w:rPr>
-        <w:t/>
+        <w:t>ini</w:t>
       </w:r>
       <w:proofErr w:type="spellEnd"/>
       <w:r>
@@ -1288,7 +1288,7 @@
           <w:sz w:val="18"/>
           <w:szCs w:val="18"/>
         </w:rPr>
-        <w:t xml:space="preserve"/>
+        <w:t xml:space="preserve"> </w:t>
       </w:r>
       <w:r>
         <w:rPr>
@@ -1297,7 +1297,7 @@
           <w:sz w:val="18"/>
           <w:szCs w:val="18"/>
         </w:rPr>
-        <w:t/>
+        <w:t>{{</w:t>
       </w:r>
       <w:proofErr w:type="spellStart"/>
       <w:r>
@@ -1307,7 +1307,7 @@
           <w:sz w:val="18"/>
           <w:szCs w:val="18"/>
         </w:rPr>
-        <w:t/>
+        <w:t>HariTanggal</w:t>
       </w:r>
       <w:proofErr w:type="spellEnd"/>
       <w:r>
@@ -1317,7 +1317,7 @@
           <w:sz w:val="18"/>
           <w:szCs w:val="18"/>
         </w:rPr>
-        <w:t/>
+        <w:t>}}</w:t>
       </w:r>
       <w:r>
         <w:rPr>
@@ -1326,7 +1326,7 @@
           <w:sz w:val="18"/>
           <w:szCs w:val="18"/>
         </w:rPr>
-        <w:t xml:space="preserve"/>
+        <w:t xml:space="preserve"> </w:t>
       </w:r>
       <w:proofErr w:type="spellStart"/>
       <w:r>
@@ -1336,7 +1336,7 @@
           <w:sz w:val="18"/>
           <w:szCs w:val="18"/>
         </w:rPr>
-        <w:t/>
+        <w:t>Tanggal</w:t>
       </w:r>
       <w:proofErr w:type="spellEnd"/>
       <w:r>
@@ -1346,7 +1346,7 @@
           <w:sz w:val="18"/>
           <w:szCs w:val="18"/>
         </w:rPr>
-        <w:t xml:space="preserve"/>
+        <w:t xml:space="preserve"> </w:t>
       </w:r>
       <w:r>
         <w:rPr>
@@ -1355,7 +1355,7 @@
           <w:sz w:val="18"/>
           <w:szCs w:val="18"/>
         </w:rPr>
-        <w:t/>
+        <w:t>{{</w:t>
       </w:r>
       <w:proofErr w:type="spellStart"/>
       <w:r>
@@ -1365,7 +1365,7 @@
           <w:sz w:val="18"/>
           <w:szCs w:val="18"/>
         </w:rPr>
-        <w:t/>
+        <w:t>TanggalAngka</w:t>
       </w:r>
       <w:proofErr w:type="spellEnd"/>
       <w:r>
@@ -1375,7 +1375,7 @@
           <w:sz w:val="18"/>
           <w:szCs w:val="18"/>
         </w:rPr>
-        <w:t/>
+        <w:t>}}</w:t>
       </w:r>
       <w:r>
         <w:rPr>
@@ -1384,7 +1384,7 @@
           <w:sz w:val="18"/>
           <w:szCs w:val="18"/>
         </w:rPr>
-        <w:t xml:space="preserve"/>
+        <w:t xml:space="preserve"> </w:t>
       </w:r>
       <w:r>
         <w:rPr>
@@ -1393,7 +1393,7 @@
           <w:sz w:val="18"/>
           <w:szCs w:val="18"/>
         </w:rPr>
-        <w:t/>
+        <w:t>{{</w:t>
       </w:r>
       <w:proofErr w:type="spellStart"/>
       <w:r>
@@ -1403,7 +1403,7 @@
           <w:sz w:val="18"/>
           <w:szCs w:val="18"/>
         </w:rPr>
-        <w:t/>
+        <w:t>BulanTanggal</w:t>
       </w:r>
       <w:proofErr w:type="spellEnd"/>
       <w:r>
@@ -1413,7 +1413,7 @@
           <w:sz w:val="18"/>
           <w:szCs w:val="18"/>
         </w:rPr>
-        <w:t/>
+        <w:t>}}</w:t>
       </w:r>
       <w:r>
         <w:rPr>
@@ -1422,7 +1422,7 @@
           <w:sz w:val="18"/>
           <w:szCs w:val="18"/>
         </w:rPr>
-        <w:t xml:space="preserve"/>
+        <w:t xml:space="preserve"> {{</w:t>
       </w:r>
       <w:proofErr w:type="spellStart"/>
       <w:r>
@@ -1432,7 +1432,7 @@
           <w:sz w:val="18"/>
           <w:szCs w:val="18"/>
         </w:rPr>
-        <w:t/>
+        <w:t>TahunTanggal</w:t>
       </w:r>
       <w:proofErr w:type="spellEnd"/>
       <w:r>
@@ -1442,7 +1442,7 @@
           <w:sz w:val="18"/>
           <w:szCs w:val="18"/>
         </w:rPr>
-        <w:t xml:space="preserve"/>
+        <w:t xml:space="preserve">}} </w:t>
       </w:r>
       <w:proofErr w:type="spellStart"/>
       <w:r>
@@ -1452,7 +1452,7 @@
           <w:sz w:val="18"/>
           <w:szCs w:val="18"/>
         </w:rPr>
-        <w:t/>
+        <w:t>telah</w:t>
       </w:r>
       <w:proofErr w:type="spellEnd"/>
       <w:r>
@@ -1462,7 +1462,7 @@
           <w:sz w:val="18"/>
           <w:szCs w:val="18"/>
         </w:rPr>
-        <w:t xml:space="preserve"/>
+        <w:t xml:space="preserve"> </w:t>
       </w:r>
       <w:proofErr w:type="spellStart"/>
       <w:r>
@@ -1472,7 +1472,7 @@
           <w:sz w:val="18"/>
           <w:szCs w:val="18"/>
         </w:rPr>
-        <w:t/>
+        <w:t>diserahterimakan</w:t>
       </w:r>
       <w:proofErr w:type="spellEnd"/>
       <w:r>
@@ -1482,7 +1482,7 @@
           <w:sz w:val="18"/>
           <w:szCs w:val="18"/>
         </w:rPr>
-        <w:t xml:space="preserve"/>
+        <w:t xml:space="preserve"> </w:t>
       </w:r>
       <w:proofErr w:type="spellStart"/>
       <w:r>
@@ -1492,7 +1492,7 @@
           <w:sz w:val="18"/>
           <w:szCs w:val="18"/>
         </w:rPr>
-        <w:t/>
+        <w:t>perangkat</w:t>
       </w:r>
       <w:proofErr w:type="spellEnd"/>
       <w:r>
@@ -1502,7 +1502,7 @@
           <w:sz w:val="18"/>
           <w:szCs w:val="18"/>
         </w:rPr>
-        <w:t xml:space="preserve"/>
+        <w:t xml:space="preserve"> </w:t>
       </w:r>
       <w:proofErr w:type="spellStart"/>
       <w:r>
@@ -1512,7 +1512,7 @@
           <w:sz w:val="18"/>
           <w:szCs w:val="18"/>
         </w:rPr>
-        <w:t/>
+        <w:t>dengan</w:t>
       </w:r>
       <w:proofErr w:type="spellEnd"/>
       <w:r>
@@ -1522,7 +1522,7 @@
           <w:sz w:val="18"/>
           <w:szCs w:val="18"/>
         </w:rPr>
-        <w:t xml:space="preserve"/>
+        <w:t xml:space="preserve"> </w:t>
       </w:r>
       <w:proofErr w:type="spellStart"/>
       <w:r>
@@ -1532,7 +1532,7 @@
           <w:sz w:val="18"/>
           <w:szCs w:val="18"/>
         </w:rPr>
-        <w:t/>
+        <w:t>spesifikasi</w:t>
       </w:r>
       <w:proofErr w:type="spellEnd"/>
       <w:r>
@@ -1542,7 +1542,7 @@
           <w:sz w:val="18"/>
           <w:szCs w:val="18"/>
         </w:rPr>
-        <w:t xml:space="preserve"/>
+        <w:t xml:space="preserve"> </w:t>
       </w:r>
       <w:proofErr w:type="spellStart"/>
       <w:r>
@@ -1552,7 +1552,7 @@
           <w:sz w:val="18"/>
           <w:szCs w:val="18"/>
         </w:rPr>
-        <w:t/>
+        <w:t>serta</w:t>
       </w:r>
       <w:proofErr w:type="spellEnd"/>
       <w:r>
@@ -1562,7 +1562,7 @@
           <w:sz w:val="18"/>
           <w:szCs w:val="18"/>
         </w:rPr>
-        <w:t xml:space="preserve"/>
+        <w:t xml:space="preserve"> </w:t>
       </w:r>
       <w:proofErr w:type="spellStart"/>
       <w:r>
@@ -1572,7 +1572,7 @@
           <w:sz w:val="18"/>
           <w:szCs w:val="18"/>
         </w:rPr>
-        <w:t/>
+        <w:t>syarat-syarat</w:t>
       </w:r>
       <w:proofErr w:type="spellEnd"/>
       <w:r>
@@ -1582,7 +1582,7 @@
           <w:sz w:val="18"/>
           <w:szCs w:val="18"/>
         </w:rPr>
-        <w:t xml:space="preserve"/>
+        <w:t xml:space="preserve"> dan </w:t>
       </w:r>
       <w:proofErr w:type="spellStart"/>
       <w:r>
@@ -1592,7 +1592,7 @@
           <w:sz w:val="18"/>
           <w:szCs w:val="18"/>
         </w:rPr>
-        <w:t/>
+        <w:t>ketentuan</w:t>
       </w:r>
       <w:proofErr w:type="spellEnd"/>
       <w:r>
@@ -1602,7 +1602,7 @@
           <w:sz w:val="18"/>
           <w:szCs w:val="18"/>
         </w:rPr>
-        <w:t xml:space="preserve"/>
+        <w:t xml:space="preserve"> </w:t>
       </w:r>
       <w:proofErr w:type="spellStart"/>
       <w:r>
@@ -1612,7 +1612,7 @@
           <w:sz w:val="18"/>
           <w:szCs w:val="18"/>
         </w:rPr>
-        <w:t/>
+        <w:t>sebagai</w:t>
       </w:r>
       <w:proofErr w:type="spellEnd"/>
       <w:r>
@@ -1622,7 +1622,7 @@
           <w:sz w:val="18"/>
           <w:szCs w:val="18"/>
         </w:rPr>
-        <w:t xml:space="preserve"/>
+        <w:t xml:space="preserve"> </w:t>
       </w:r>
       <w:proofErr w:type="spellStart"/>
       <w:r>
@@ -1632,7 +1632,7 @@
           <w:sz w:val="18"/>
           <w:szCs w:val="18"/>
         </w:rPr>
-        <w:t/>
+        <w:t>berikut</w:t>
       </w:r>
       <w:proofErr w:type="spellEnd"/>
       <w:r>
@@ -1642,7 +1642,7 @@
           <w:sz w:val="18"/>
           <w:szCs w:val="18"/>
         </w:rPr>
-        <w:t/>
+        <w:t>:</w:t>
       </w:r>
     </w:p>
     <w:p>
@@ -1680,7 +1680,7 @@
           <w:u w:val="single"/>
           <w:lang w:val="nb-NO"/>
         </w:rPr>
-        <w:t>Jenis Perangkat Keras: CCTV</w:t>
+        <w:t>Jenis</w:t>
       </w:r>
       <w:r>
         <w:rPr>
@@ -1690,7 +1690,7 @@
           <w:u w:val="single"/>
           <w:lang w:val="nb-NO"/>
         </w:rPr>
-        <w:t xml:space="preserve"/>
+        <w:t xml:space="preserve"> </w:t>
       </w:r>
       <w:r>
         <w:rPr>
@@ -1702,7 +1702,7 @@
           <w:u w:val="single"/>
           <w:lang w:val="nb-NO"/>
         </w:rPr>
-        <w:t/>
+        <w:t>Perangkat Keras: CCTV</w:t>
       </w:r>
     </w:p>
     <w:tbl>
@@ -2797,7 +2797,7 @@
                           <pic:cNvPicPr/>
                         </pic:nvPicPr>
                         <pic:blipFill>
-                          <a:blip r:embed="R088111f966854dd1"/>
+                          <a:blip r:embed="R651e8e61ee51431f"/>
                           <a:stretch>
                             <a:fillRect/>
                           </a:stretch>
@@ -2859,9 +2859,6 @@
               </w:rPr>
             </w:pPr>
             <w:r>
-              <w:rPr>
-                <w:color w:val="FFFFFF"/>
-              </w:rPr>
               <w:t>{{SIG_APPROVER}}</w:t>
             </w:r>
           </w:p>
@@ -2900,9 +2897,6 @@
               <w:ind w:left="0"/>
             </w:pPr>
             <w:r>
-              <w:rPr>
-                <w:color w:val="FFFFFF"/>
-              </w:rPr>
               <w:t>{{SIG_PJ}}</w:t>
             </w:r>
           </w:p>
@@ -3006,7 +3000,7 @@
           <w:sz w:val="18"/>
           <w:szCs w:val="18"/>
         </w:rPr>
-        <w:t>Sesuai dengan Tiket di My SSC No. INC-0000</w:t>
+        <w:t>Sesuai</w:t>
       </w:r>
       <w:proofErr w:type="spellEnd"/>
       <w:r>
@@ -3014,7 +3008,7 @@
           <w:sz w:val="18"/>
           <w:szCs w:val="18"/>
         </w:rPr>
-        <w:t xml:space="preserve"/>
+        <w:t xml:space="preserve"> </w:t>
       </w:r>
       <w:proofErr w:type="spellStart"/>
       <w:r>
@@ -3022,7 +3016,7 @@
           <w:sz w:val="18"/>
           <w:szCs w:val="18"/>
         </w:rPr>
-        <w:t/>
+        <w:t>dengan</w:t>
       </w:r>
       <w:proofErr w:type="spellEnd"/>
       <w:r>
@@ -3030,7 +3024,7 @@
           <w:sz w:val="18"/>
           <w:szCs w:val="18"/>
         </w:rPr>
-        <w:t xml:space="preserve"/>
+        <w:t xml:space="preserve"> </w:t>
       </w:r>
       <w:proofErr w:type="spellStart"/>
       <w:r>
@@ -3038,7 +3032,7 @@
           <w:sz w:val="18"/>
           <w:szCs w:val="18"/>
         </w:rPr>
-        <w:t/>
+        <w:t>Tiket</w:t>
       </w:r>
       <w:proofErr w:type="spellEnd"/>
       <w:r>
@@ -3046,7 +3040,7 @@
           <w:sz w:val="18"/>
           <w:szCs w:val="18"/>
         </w:rPr>
-        <w:t xml:space="preserve"/>
+        <w:t xml:space="preserve"> di My SSC No. </w:t>
       </w:r>
       <w:r>
         <w:rPr>
@@ -3054,7 +3048,7 @@
           <w:sz w:val="18"/>
           <w:szCs w:val="18"/>
         </w:rPr>
-        <w:t/>
+        <w:t>INC-0000</w:t>
       </w:r>
     </w:p>
     <w:p>
@@ -3070,14 +3064,14 @@
           <w:sz w:val="18"/>
           <w:szCs w:val="18"/>
         </w:rPr>
-        <w:t xml:space="preserve">Luthfi AP - Procurement Sumbagsel</w:t>
-      </w:r>
-      <w:r>
-        <w:rPr>
-          <w:sz w:val="18"/>
-          <w:szCs w:val="18"/>
-        </w:rPr>
-        <w:t/>
+        <w:t xml:space="preserve">Luthfi AP - </w:t>
+      </w:r>
+      <w:r>
+        <w:rPr>
+          <w:sz w:val="18"/>
+          <w:szCs w:val="18"/>
+        </w:rPr>
+        <w:t>Procurement Sumbagsel</w:t>
       </w:r>
     </w:p>
     <w:p>

</xml_diff>